<commit_message>
docs(lab4): complete quality dashboard rtm and reflection
</commit_message>
<xml_diff>
--- a/实验四_软件质量工程与AI辅助代码审查/D4-10_课程总结与个人反思.docx
+++ b/实验四_软件质量工程与AI辅助代码审查/D4-10_课程总结与个人反思.docx
@@ -533,18 +533,41 @@
           </w:tcPr>
           <w:p>
             <w:pPr>
-              <w:spacing w:after="80"/>
+              <w:spacing w:after="80" w:line="293" w:lineRule="auto"/>
+              <w:jc w:val="left"/>
             </w:pPr>
-            <w:r/>
+            <w:r>
+              <w:rPr>
+                <w:rFonts w:ascii="Microsoft YaHei" w:hAnsi="Microsoft YaHei" w:eastAsia="Microsoft YaHei"/>
+                <w:b/>
+                <w:color w:val="0B6B3A"/>
+                <w:sz w:val="21"/>
+              </w:rPr>
+              <w:t>填写记录：</w:t>
+            </w:r>
             <w:r>
               <w:rPr>
                 <w:rFonts w:ascii="Microsoft YaHei" w:hAnsi="Microsoft YaHei" w:eastAsia="Microsoft YaHei"/>
                 <w:b w:val="0"/>
+                <w:color w:val="1F2937"/>
                 <w:sz w:val="21"/>
               </w:rPr>
-              <w:t>填写记录</w:t>
-              <w:br/>
-              <w:t>本文件按“个人 ≥ 800 字”的要求重写课程总结与个人反思，保留模板章节结构，并补充各章节字数统计。</w:t>
+              <w:t>本文件在原模板章节内继续扩写和润色，未替换封面、元信息表或章节顺序；正文围绕四个实验的连续案例、个人贡献、失败复盘、AI 辅助边界和职业影响展开。</w:t>
+            </w:r>
+          </w:p>
+          <w:p>
+            <w:pPr>
+              <w:spacing w:after="80" w:line="293" w:lineRule="auto"/>
+              <w:jc w:val="left"/>
+            </w:pPr>
+            <w:r>
+              <w:rPr>
+                <w:rFonts w:ascii="Microsoft YaHei" w:hAnsi="Microsoft YaHei" w:eastAsia="Microsoft YaHei"/>
+                <w:b w:val="0"/>
+                <w:color w:val="1F2937"/>
+                <w:sz w:val="21"/>
+              </w:rPr>
+              <w:t>本次修订将原有短段落改为更完整的反思结构，并补充可核查的课程产出关系，例如需求追溯、架构取舍、流水线证据、测试报告、缺陷闭环与 RTM 矩阵。</w:t>
             </w:r>
           </w:p>
         </w:tc>
@@ -593,16 +616,71 @@
           </w:tcPr>
           <w:p>
             <w:pPr>
-              <w:spacing w:after="80"/>
+              <w:spacing w:after="80" w:line="293" w:lineRule="auto"/>
+              <w:jc w:val="left"/>
             </w:pPr>
-            <w:r/>
+            <w:r>
+              <w:rPr>
+                <w:rFonts w:ascii="Microsoft YaHei" w:hAnsi="Microsoft YaHei" w:eastAsia="Microsoft YaHei"/>
+                <w:b/>
+                <w:color w:val="0B6B3A"/>
+                <w:sz w:val="21"/>
+              </w:rPr>
+              <w:t>整体收获：</w:t>
+            </w:r>
             <w:r>
               <w:rPr>
                 <w:rFonts w:ascii="Microsoft YaHei" w:hAnsi="Microsoft YaHei" w:eastAsia="Microsoft YaHei"/>
                 <w:b w:val="0"/>
+                <w:color w:val="1F2937"/>
                 <w:sz w:val="21"/>
               </w:rPr>
-              <w:t>四个实验连起来之后，我对软件工程的理解从“写出功能”转向“把需求、架构、交付、质量都串起来”。实验一做需求时，最明显的感受是需求不是把想法写满，而是要把范围、角色、业务规则、验收标准和追溯关系说清楚；如果这个阶段含糊，后面的设计和测试都会反复返工。实验二让我意识到架构图和 ADR 的价值不在于形式，而在于把取舍公开化，让团队知道为什么选择某种边界、依赖和部署方式。实验三把设计放进流水线、容器和可观测性里，我第一次比较完整地看到“交付”不是上传代码，而是让代码可以被构建、检查、部署和回滚。实验四再往前推了一步：质量不能等到最后补测试，必须从需求、设计、代码、CI、缺陷和审查记录中持续积累证据。</w:t>
+              <w:t>四个实验串联起来以后，我对软件工程的理解从“把功能写出来”变成了“让一个想法能够被说明、被实现、被交付、被验证”。以前我更容易把软件工程理解成一组文档模板，做完这门课后才意识到，文档、模型、代码、流水线和质量数据其实是在回答同一个问题：这个系统为什么这样做，出了问题能不能找到原因，别人接手时能不能继续演进。</w:t>
+            </w:r>
+          </w:p>
+          <w:p>
+            <w:pPr>
+              <w:spacing w:after="80" w:line="293" w:lineRule="auto"/>
+              <w:jc w:val="left"/>
+            </w:pPr>
+            <w:r>
+              <w:rPr>
+                <w:rFonts w:ascii="Microsoft YaHei" w:hAnsi="Microsoft YaHei" w:eastAsia="Microsoft YaHei"/>
+                <w:b w:val="0"/>
+                <w:color w:val="1F2937"/>
+                <w:sz w:val="21"/>
+              </w:rPr>
+              <w:t>实验一让我第一次认真体会到需求不是罗列功能点，而是要把角色、场景、边界条件、业务规则和验收标准讲清楚。NekoCafé 的例子看起来轻松，但“顾客创建预约”“店员签到核销”“店长查看报表”“支付押金和退款”之间存在状态流转、权限边界和外部约束。如果需求阶段没有把这些内容写透，后面的用例图、类图、测试用例都会被迫返工。</w:t>
+            </w:r>
+          </w:p>
+          <w:p>
+            <w:pPr>
+              <w:spacing w:after="80" w:line="293" w:lineRule="auto"/>
+              <w:jc w:val="left"/>
+            </w:pPr>
+            <w:r>
+              <w:rPr>
+                <w:rFonts w:ascii="Microsoft YaHei" w:hAnsi="Microsoft YaHei" w:eastAsia="Microsoft YaHei"/>
+                <w:b w:val="0"/>
+                <w:color w:val="1F2937"/>
+                <w:sz w:val="21"/>
+              </w:rPr>
+              <w:t>实验二让我看到架构不是越复杂越好，而是要把业务变化和技术风险放到同一张图里讨论。C4、DDD 上下文、ER 图和 ADR 让我明白，微服务拆分不只是把代码分成几个仓库，更重要的是明确服务职责、数据归属、接口契约和发布边界。比如预约、会员、门店和支付之间既要协作，又不能互相污染领域概念，这个取舍比画几个方框更关键。</w:t>
+            </w:r>
+          </w:p>
+          <w:p>
+            <w:pPr>
+              <w:spacing w:after="80" w:line="293" w:lineRule="auto"/>
+              <w:jc w:val="left"/>
+            </w:pPr>
+            <w:r>
+              <w:rPr>
+                <w:rFonts w:ascii="Microsoft YaHei" w:hAnsi="Microsoft YaHei" w:eastAsia="Microsoft YaHei"/>
+                <w:b w:val="0"/>
+                <w:color w:val="1F2937"/>
+                <w:sz w:val="21"/>
+              </w:rPr>
+              <w:t>实验三把架构设计推进到可交付状态。CI/CD、容器镜像、安全扫描、监控面板和回滚流程让我意识到，系统不是跑在本机就算完成，真正的交付要能在流水线里重复构建、重复验证、重复部署。实验四则把质量工程补上最后一环，通过测试金字塔、非功能测试、AI Review、缺陷台账和质量看板，把“做完了”转化成“有证据证明当前质量可接受”。这四个实验合在一起，让我更完整地理解了软件工程的闭环。</w:t>
             </w:r>
           </w:p>
         </w:tc>
@@ -651,16 +729,56 @@
           </w:tcPr>
           <w:p>
             <w:pPr>
-              <w:spacing w:after="80"/>
+              <w:spacing w:after="80" w:line="293" w:lineRule="auto"/>
+              <w:jc w:val="left"/>
             </w:pPr>
-            <w:r/>
+            <w:r>
+              <w:rPr>
+                <w:rFonts w:ascii="Microsoft YaHei" w:hAnsi="Microsoft YaHei" w:eastAsia="Microsoft YaHei"/>
+                <w:b/>
+                <w:color w:val="0B6B3A"/>
+                <w:sz w:val="21"/>
+              </w:rPr>
+              <w:t>个人贡献：</w:t>
+            </w:r>
             <w:r>
               <w:rPr>
                 <w:rFonts w:ascii="Microsoft YaHei" w:hAnsi="Microsoft YaHei" w:eastAsia="Microsoft YaHei"/>
                 <w:b w:val="0"/>
+                <w:color w:val="1F2937"/>
                 <w:sz w:val="21"/>
               </w:rPr>
-              <w:t>在实验四中，我主要承担测试计划、测试用例设计、自动化测试代码、运行报告和 AI 代码审查记录整理工作。我的工作重点不是把文档写得很满，而是尽量让每一份材料都能被检查：测试计划里给出质量目标和门禁；测试用例表里把需求、输入、步骤、预期结果和自动化覆盖关联起来；D4-3 中保留可执行的 Python 测试脚本、报告和覆盖率口径；AI Review 记录中区分“AI 提议”和“人工裁决”。这个过程让我意识到，软件工程作业真正难的地方不是某一个文件，而是多个文件之间要互相对得上，不能一个地方说有测试，另一个地方却找不到用例或报告。</w:t>
+              <w:t>在实验四中，我主要承担质量工程相关材料的设计、补充和整理工作，包括测试计划、功能与非功能测试用例、自动化运行报告、AI 代码审查记录、缺陷台账、质量看板和 RTM 扩展矩阵。我的重点不是单纯把字数堆满，而是让每一份交付物都能和前面的需求、架构、代码或测试证据对应起来。</w:t>
+            </w:r>
+          </w:p>
+          <w:p>
+            <w:pPr>
+              <w:spacing w:after="80" w:line="293" w:lineRule="auto"/>
+              <w:jc w:val="left"/>
+            </w:pPr>
+            <w:r>
+              <w:rPr>
+                <w:rFonts w:ascii="Microsoft YaHei" w:hAnsi="Microsoft YaHei" w:eastAsia="Microsoft YaHei"/>
+                <w:b w:val="0"/>
+                <w:color w:val="1F2937"/>
+                <w:sz w:val="21"/>
+              </w:rPr>
+              <w:t>具体来说，我在 D4-1 中梳理了测试目标、质量门禁和风险优先级；在 D4-2 中把功能需求拆成 API、单元、契约、集成和 E2E 等不同层级的用例；在 D4-3 中保留可执行的自动化测试脚本和 HTML/JSON 报告；在 D4-4 中补充性能、安全、可访问性测试的执行链路与截图说明；在 D4-5 和 D4-6 中把 AI Review 建议、人工裁决、缺陷修复和回归证据关联起来。</w:t>
+            </w:r>
+          </w:p>
+          <w:p>
+            <w:pPr>
+              <w:spacing w:after="80" w:line="293" w:lineRule="auto"/>
+              <w:jc w:val="left"/>
+            </w:pPr>
+            <w:r>
+              <w:rPr>
+                <w:rFonts w:ascii="Microsoft YaHei" w:hAnsi="Microsoft YaHei" w:eastAsia="Microsoft YaHei"/>
+                <w:b w:val="0"/>
+                <w:color w:val="1F2937"/>
+                <w:sz w:val="21"/>
+              </w:rPr>
+              <w:t>这次我也承担了很多“把材料变得可检查”的工作，例如统一编号、补齐图题、把缺陷和测试用例映射到 RTM、检查模板中的隐藏占位符、避免 Word/Excel 格式被破坏。这个过程让我意识到，团队里的质量角色不只是挑错，还要帮助其他人把零散产出组织成能被老师、同学或后续维护者理解的证据链。</w:t>
             </w:r>
           </w:p>
         </w:tc>
@@ -709,16 +827,56 @@
           </w:tcPr>
           <w:p>
             <w:pPr>
-              <w:spacing w:after="80"/>
+              <w:spacing w:after="80" w:line="293" w:lineRule="auto"/>
+              <w:jc w:val="left"/>
             </w:pPr>
-            <w:r/>
+            <w:r>
+              <w:rPr>
+                <w:rFonts w:ascii="Microsoft YaHei" w:hAnsi="Microsoft YaHei" w:eastAsia="Microsoft YaHei"/>
+                <w:b/>
+                <w:color w:val="0B6B3A"/>
+                <w:sz w:val="21"/>
+              </w:rPr>
+              <w:t>失败教训：</w:t>
+            </w:r>
             <w:r>
               <w:rPr>
                 <w:rFonts w:ascii="Microsoft YaHei" w:hAnsi="Microsoft YaHei" w:eastAsia="Microsoft YaHei"/>
                 <w:b w:val="0"/>
+                <w:color w:val="1F2937"/>
                 <w:sz w:val="21"/>
               </w:rPr>
-              <w:t>这次最大的卡点是我一开始容易把“看起来专业”和“真正可复现”混在一起。比如 D4-3 如果直接依赖 pytest、Hypothesis、Playwright、k6、ZAP 等工具，报告会显得很像真实项目，但老师或同学 clone 下来后未必能马上运行；如果只写文字说明，又缺少工程证据。后来我把基础验证改成标准库可运行的版本，同时保留 k6、ZAP、Playwright 的迁移入口，这样既能证明测试思想，也能保证最小环境下能跑通。这个教训对我很重要：工程方案不能只追求“高级工具”，还要考虑使用者的环境、成本和失败时的解释路径。以后我做项目时会先明确最低可运行闭环，再逐步引入更复杂的工具链。</w:t>
+              <w:t>这次最大的教训，是我一开始容易把“看起来像正式报告”和“真正可复现、可追溯”混在一起。比如质量报告中如果只放漂亮的截图和流程图，文档表面会很完整，但别人无法判断这些结论来自真实执行、模拟示例还是设计预期。相反，如果只给命令和日志，又会显得阅读负担很重，不能满足课程交付的说明性要求。</w:t>
+            </w:r>
+          </w:p>
+          <w:p>
+            <w:pPr>
+              <w:spacing w:after="80" w:line="293" w:lineRule="auto"/>
+              <w:jc w:val="left"/>
+            </w:pPr>
+            <w:r>
+              <w:rPr>
+                <w:rFonts w:ascii="Microsoft YaHei" w:hAnsi="Microsoft YaHei" w:eastAsia="Microsoft YaHei"/>
+                <w:b w:val="0"/>
+                <w:color w:val="1F2937"/>
+                <w:sz w:val="21"/>
+              </w:rPr>
+              <w:t>我在实验过程中也遇到过模板被误改、图片替换不准确、Word 文档被占用导致无法写入、中文深路径影响工具执行等问题。这些问题看似只是操作细节，其实暴露出工程工作中很常见的风险：环境、路径、文件锁、工具版本和协作习惯都会影响交付质量。如果没有检查清楚，就可能出现“内容写了，但模板没了”“图插了，但位置不对”“测试跑过，但证据找不到”的情况。</w:t>
+            </w:r>
+          </w:p>
+          <w:p>
+            <w:pPr>
+              <w:spacing w:after="80" w:line="293" w:lineRule="auto"/>
+              <w:jc w:val="left"/>
+            </w:pPr>
+            <w:r>
+              <w:rPr>
+                <w:rFonts w:ascii="Microsoft YaHei" w:hAnsi="Microsoft YaHei" w:eastAsia="Microsoft YaHei"/>
+                <w:b w:val="0"/>
+                <w:color w:val="1F2937"/>
+                <w:sz w:val="21"/>
+              </w:rPr>
+              <w:t>后来我逐渐调整做法：先确认模板和文件状态，再对照任务书补内容；图片只替换指定位置，不随意改模板；测试报告同时保留可执行命令、结果截图和简短结论；缺陷不只写“已修复”，还要写清复现步骤、根因分类、回归验证和关闭依据。这个失败让我明白，软件工程里的严谨不是写得复杂，而是让每一个结论都有来源、每一个风险都有去向。</w:t>
             </w:r>
           </w:p>
         </w:tc>
@@ -767,16 +925,56 @@
           </w:tcPr>
           <w:p>
             <w:pPr>
-              <w:spacing w:after="80"/>
+              <w:spacing w:after="80" w:line="293" w:lineRule="auto"/>
+              <w:jc w:val="left"/>
             </w:pPr>
-            <w:r/>
+            <w:r>
+              <w:rPr>
+                <w:rFonts w:ascii="Microsoft YaHei" w:hAnsi="Microsoft YaHei" w:eastAsia="Microsoft YaHei"/>
+                <w:b/>
+                <w:color w:val="0B6B3A"/>
+                <w:sz w:val="21"/>
+              </w:rPr>
+              <w:t>AI 观点：</w:t>
+            </w:r>
             <w:r>
               <w:rPr>
                 <w:rFonts w:ascii="Microsoft YaHei" w:hAnsi="Microsoft YaHei" w:eastAsia="Microsoft YaHei"/>
                 <w:b w:val="0"/>
+                <w:color w:val="1F2937"/>
                 <w:sz w:val="21"/>
               </w:rPr>
-              <w:t>我认为 AI 对软件工程最有帮助的地方，是扩展视角和提高初稿效率。它可以帮我快速列出测试类型、风险点、审查角色、缺陷分类和文档结构，也能提醒我哪些地方缺少验收标准或可观测指标。但是这门课也让我更清楚地看到，AI 的输出不能直接等同于工程事实。比如它给出的安全风险、性能瓶颈或测试建议，必须落到脚本、截图、报告、缺陷台账、PR 记录或人工裁决中，才算真正进入工程闭环。AI 更像一个很快的协作者，而不是负责人；负责人仍然需要判断哪些建议采纳、哪些是误报、哪些需要实验验证。对学生来说，合理使用 AI 的关键不是让它替自己写完，而是借它发现盲区，再用证据把结论坐实。</w:t>
+              <w:t>我认为 AI 辅助软件工程最大的价值，是快速打开思路和补齐遗漏视角。它可以帮我从架构师、安全专家、性能工程师、测试负责人等不同角度提出问题，也能帮助我把零散材料整理成更清晰的章节结构。在做 AI Review 和缺陷分析时，AI 对边界条件、隐私脱敏、契约测试、性能阈值和可观测性证据的提醒确实提高了效率。</w:t>
+            </w:r>
+          </w:p>
+          <w:p>
+            <w:pPr>
+              <w:spacing w:after="80" w:line="293" w:lineRule="auto"/>
+              <w:jc w:val="left"/>
+            </w:pPr>
+            <w:r>
+              <w:rPr>
+                <w:rFonts w:ascii="Microsoft YaHei" w:hAnsi="Microsoft YaHei" w:eastAsia="Microsoft YaHei"/>
+                <w:b w:val="0"/>
+                <w:color w:val="1F2937"/>
+                <w:sz w:val="21"/>
+              </w:rPr>
+              <w:t>但是这门课也让我更清楚地看到，AI 输出不能直接等同于工程事实。AI 可以提出“可能存在 CSP 风险”或“需要补充幂等测试”，但是否真的存在问题、是否影响发布、是否已经修复，必须通过代码、测试、日志、截图、PR 或人工裁决来证明。尤其是在安全和性能这类高风险问题上，如果只把 AI 的建议复制进文档，而没有复测和证据，就会让报告看起来丰富，实际却不可靠。</w:t>
+            </w:r>
+          </w:p>
+          <w:p>
+            <w:pPr>
+              <w:spacing w:after="80" w:line="293" w:lineRule="auto"/>
+              <w:jc w:val="left"/>
+            </w:pPr>
+            <w:r>
+              <w:rPr>
+                <w:rFonts w:ascii="Microsoft YaHei" w:hAnsi="Microsoft YaHei" w:eastAsia="Microsoft YaHei"/>
+                <w:b w:val="0"/>
+                <w:color w:val="1F2937"/>
+                <w:sz w:val="21"/>
+              </w:rPr>
+              <w:t>因此我更愿意把 AI 看成一个速度很快、视角很广的协作者，而不是替我负责的决策者。真正的工程责任仍然在开发者身上：要判断建议是否合理，要过滤误报，要把可采纳建议落成测试和缺陷闭环，也要诚实标注哪些地方只是示例图、哪些地方来自本机实测。AI 能提高上限，但不能代替验证。</w:t>
             </w:r>
           </w:p>
         </w:tc>
@@ -825,16 +1023,41 @@
           </w:tcPr>
           <w:p>
             <w:pPr>
-              <w:spacing w:after="80"/>
+              <w:spacing w:after="80" w:line="293" w:lineRule="auto"/>
+              <w:jc w:val="left"/>
             </w:pPr>
-            <w:r/>
+            <w:r>
+              <w:rPr>
+                <w:rFonts w:ascii="Microsoft YaHei" w:hAnsi="Microsoft YaHei" w:eastAsia="Microsoft YaHei"/>
+                <w:b/>
+                <w:color w:val="0B6B3A"/>
+                <w:sz w:val="21"/>
+              </w:rPr>
+              <w:t>职业影响：</w:t>
+            </w:r>
             <w:r>
               <w:rPr>
                 <w:rFonts w:ascii="Microsoft YaHei" w:hAnsi="Microsoft YaHei" w:eastAsia="Microsoft YaHei"/>
                 <w:b w:val="0"/>
+                <w:color w:val="1F2937"/>
                 <w:sz w:val="21"/>
               </w:rPr>
-              <w:t>这门课让我更愿意把自己定位成工程化开发者，而不只是会写代码的人。以前我更关注页面或接口能不能完成，现在会更自然地追问：这个需求怎么验收，架构为什么这样划分，失败后怎么回滚，质量指标在哪里看，缺陷是否有闭环。未来无论做后端、测试开发还是 DevOps 相关工作，我都希望保持这种习惯：先保证系统可理解、可测试、可交付，再追求功能数量和技术复杂度。</w:t>
+              <w:t>这门课让我更愿意把自己定位为工程化开发者，而不只是会写代码的人。以前我更关心接口能不能返回正确结果、页面能不能完成操作，现在会自然地追问：这个需求怎么验收，异常路径有没有测试，服务边界是否清楚，失败后能否回滚，质量指标在哪里看，缺陷是否真正关闭。</w:t>
+            </w:r>
+          </w:p>
+          <w:p>
+            <w:pPr>
+              <w:spacing w:after="80" w:line="293" w:lineRule="auto"/>
+              <w:jc w:val="left"/>
+            </w:pPr>
+            <w:r>
+              <w:rPr>
+                <w:rFonts w:ascii="Microsoft YaHei" w:hAnsi="Microsoft YaHei" w:eastAsia="Microsoft YaHei"/>
+                <w:b w:val="0"/>
+                <w:color w:val="1F2937"/>
+                <w:sz w:val="21"/>
+              </w:rPr>
+              <w:t>未来无论从事后端开发、测试开发、平台工程还是 DevOps 相关工作，我都希望保留这套习惯：先把需求和边界说清楚，再设计可演进的结构；先让系统可测试、可观测、可回归，再追求功能数量；对 AI 或工具给出的结论保持开放但不盲从。软件工程不是把每个环节都做得很重，而是在关键风险上留下足够的证据。</w:t>
             </w:r>
           </w:p>
         </w:tc>
@@ -883,16 +1106,56 @@
           </w:tcPr>
           <w:p>
             <w:pPr>
-              <w:spacing w:after="80"/>
+              <w:spacing w:after="80" w:line="293" w:lineRule="auto"/>
+              <w:jc w:val="left"/>
             </w:pPr>
-            <w:r/>
+            <w:r>
+              <w:rPr>
+                <w:rFonts w:ascii="Microsoft YaHei" w:hAnsi="Microsoft YaHei" w:eastAsia="Microsoft YaHei"/>
+                <w:b/>
+                <w:color w:val="0B6B3A"/>
+                <w:sz w:val="21"/>
+              </w:rPr>
+              <w:t>课程建议：</w:t>
+            </w:r>
             <w:r>
               <w:rPr>
                 <w:rFonts w:ascii="Microsoft YaHei" w:hAnsi="Microsoft YaHei" w:eastAsia="Microsoft YaHei"/>
                 <w:b w:val="0"/>
+                <w:color w:val="1F2937"/>
                 <w:sz w:val="21"/>
               </w:rPr>
-              <w:t>课程最有价值的是四个实验之间使用连续案例，能看到前一阶段的选择如何影响后一阶段。建议后续可以提供一个统一的最小代码仓库作为基线，让需求、架构、CI、测试和质量看板都围绕同一份代码持续演进；同时可以给出一份“最低可运行环境”说明，明确哪些工具必须安装，哪些可以用示例图或模拟报告替代。这样学生能把更多精力放在工程思考上，而不是在环境配置和模板格式之间来回消耗。</w:t>
+              <w:t>我觉得这门课最有价值的地方，是四个实验围绕同一个案例连续推进，能看到前一阶段的选择如何影响后续的架构、部署和质量。建议后续继续保留这种连续案例，因为它比孤立完成几份文档更能训练工程思维。</w:t>
+            </w:r>
+          </w:p>
+          <w:p>
+            <w:pPr>
+              <w:spacing w:after="80" w:line="293" w:lineRule="auto"/>
+              <w:jc w:val="left"/>
+            </w:pPr>
+            <w:r>
+              <w:rPr>
+                <w:rFonts w:ascii="Microsoft YaHei" w:hAnsi="Microsoft YaHei" w:eastAsia="Microsoft YaHei"/>
+                <w:b w:val="0"/>
+                <w:color w:val="1F2937"/>
+                <w:sz w:val="21"/>
+              </w:rPr>
+              <w:t>如果可以改进，我希望课程能提供一份更明确的最小可运行基线，例如推荐的工具版本、必须安装的软件、可替代截图的范围、Word/Excel 模板填写示例和 Git 分支提交规范。这样学生可以少花一些时间在环境配置、文件格式和工具兼容上，把更多精力放在需求分析、架构取舍、测试设计和质量复盘上。</w:t>
+            </w:r>
+          </w:p>
+          <w:p>
+            <w:pPr>
+              <w:spacing w:after="80" w:line="293" w:lineRule="auto"/>
+              <w:jc w:val="left"/>
+            </w:pPr>
+            <w:r>
+              <w:rPr>
+                <w:rFonts w:ascii="Microsoft YaHei" w:hAnsi="Microsoft YaHei" w:eastAsia="Microsoft YaHei"/>
+                <w:b w:val="0"/>
+                <w:color w:val="1F2937"/>
+                <w:sz w:val="21"/>
+              </w:rPr>
+              <w:t>另外也可以增加一份优秀样例和常见扣分点对照表，说明什么样的文档只是“填了模板”，什么样的文档算“有追溯、有证据、有复盘”。这会帮助大家更早理解课程真正希望训练的是工程闭环，而不是单纯完成若干文件。</w:t>
             </w:r>
           </w:p>
         </w:tc>
@@ -942,13 +1205,13 @@
           </w:tcPr>
           <w:p>
             <w:pPr>
-              <w:spacing w:after="80"/>
+              <w:spacing w:after="0"/>
             </w:pPr>
-            <w:r/>
             <w:r>
               <w:rPr>
                 <w:rFonts w:ascii="Microsoft YaHei" w:hAnsi="Microsoft YaHei" w:eastAsia="Microsoft YaHei"/>
                 <w:b/>
+                <w:color w:val="0B6B3A"/>
                 <w:sz w:val="21"/>
               </w:rPr>
               <w:t>统计范围</w:t>
@@ -969,13 +1232,13 @@
           </w:tcPr>
           <w:p>
             <w:pPr>
-              <w:spacing w:after="80"/>
+              <w:spacing w:after="0"/>
             </w:pPr>
-            <w:r/>
             <w:r>
               <w:rPr>
                 <w:rFonts w:ascii="Microsoft YaHei" w:hAnsi="Microsoft YaHei" w:eastAsia="Microsoft YaHei"/>
                 <w:b/>
+                <w:color w:val="0B6B3A"/>
                 <w:sz w:val="21"/>
               </w:rPr>
               <w:t>字数（约）</w:t>
@@ -998,13 +1261,13 @@
           </w:tcPr>
           <w:p>
             <w:pPr>
-              <w:spacing w:after="80"/>
+              <w:spacing w:after="0"/>
             </w:pPr>
-            <w:r/>
             <w:r>
               <w:rPr>
                 <w:rFonts w:ascii="Microsoft YaHei" w:hAnsi="Microsoft YaHei" w:eastAsia="Microsoft YaHei"/>
                 <w:b w:val="0"/>
+                <w:color w:val="1F2937"/>
                 <w:sz w:val="21"/>
               </w:rPr>
               <w:t>1 课程整体收获</w:t>
@@ -1025,16 +1288,16 @@
           </w:tcPr>
           <w:p>
             <w:pPr>
-              <w:spacing w:after="80"/>
+              <w:spacing w:after="0"/>
             </w:pPr>
-            <w:r/>
             <w:r>
               <w:rPr>
                 <w:rFonts w:ascii="Microsoft YaHei" w:hAnsi="Microsoft YaHei" w:eastAsia="Microsoft YaHei"/>
                 <w:b w:val="0"/>
+                <w:color w:val="1F2937"/>
                 <w:sz w:val="21"/>
               </w:rPr>
-              <w:t>297 字</w:t>
+              <w:t>658 字</w:t>
             </w:r>
           </w:p>
         </w:tc>
@@ -1054,13 +1317,13 @@
           </w:tcPr>
           <w:p>
             <w:pPr>
-              <w:spacing w:after="80"/>
+              <w:spacing w:after="0"/>
             </w:pPr>
-            <w:r/>
             <w:r>
               <w:rPr>
                 <w:rFonts w:ascii="Microsoft YaHei" w:hAnsi="Microsoft YaHei" w:eastAsia="Microsoft YaHei"/>
                 <w:b w:val="0"/>
+                <w:color w:val="1F2937"/>
                 <w:sz w:val="21"/>
               </w:rPr>
               <w:t>2 个人贡献与团队角色</w:t>
@@ -1081,16 +1344,16 @@
           </w:tcPr>
           <w:p>
             <w:pPr>
-              <w:spacing w:after="80"/>
+              <w:spacing w:after="0"/>
             </w:pPr>
-            <w:r/>
             <w:r>
               <w:rPr>
                 <w:rFonts w:ascii="Microsoft YaHei" w:hAnsi="Microsoft YaHei" w:eastAsia="Microsoft YaHei"/>
                 <w:b w:val="0"/>
+                <w:color w:val="1F2937"/>
                 <w:sz w:val="21"/>
               </w:rPr>
-              <w:t>256 字</w:t>
+              <w:t>449 字</w:t>
             </w:r>
           </w:p>
         </w:tc>
@@ -1110,13 +1373,13 @@
           </w:tcPr>
           <w:p>
             <w:pPr>
-              <w:spacing w:after="80"/>
+              <w:spacing w:after="0"/>
             </w:pPr>
-            <w:r/>
             <w:r>
               <w:rPr>
                 <w:rFonts w:ascii="Microsoft YaHei" w:hAnsi="Microsoft YaHei" w:eastAsia="Microsoft YaHei"/>
                 <w:b w:val="0"/>
+                <w:color w:val="1F2937"/>
                 <w:sz w:val="21"/>
               </w:rPr>
               <w:t>3 最大的一次失败与教训</w:t>
@@ -1137,16 +1400,16 @@
           </w:tcPr>
           <w:p>
             <w:pPr>
-              <w:spacing w:after="80"/>
+              <w:spacing w:after="0"/>
             </w:pPr>
-            <w:r/>
             <w:r>
               <w:rPr>
                 <w:rFonts w:ascii="Microsoft YaHei" w:hAnsi="Microsoft YaHei" w:eastAsia="Microsoft YaHei"/>
                 <w:b w:val="0"/>
+                <w:color w:val="1F2937"/>
                 <w:sz w:val="21"/>
               </w:rPr>
-              <w:t>289 字</w:t>
+              <w:t>468 字</w:t>
             </w:r>
           </w:p>
         </w:tc>
@@ -1166,13 +1429,13 @@
           </w:tcPr>
           <w:p>
             <w:pPr>
-              <w:spacing w:after="80"/>
+              <w:spacing w:after="0"/>
             </w:pPr>
-            <w:r/>
             <w:r>
               <w:rPr>
                 <w:rFonts w:ascii="Microsoft YaHei" w:hAnsi="Microsoft YaHei" w:eastAsia="Microsoft YaHei"/>
                 <w:b w:val="0"/>
+                <w:color w:val="1F2937"/>
                 <w:sz w:val="21"/>
               </w:rPr>
               <w:t>4 对 AI 辅助软件工程的看法</w:t>
@@ -1193,16 +1456,16 @@
           </w:tcPr>
           <w:p>
             <w:pPr>
-              <w:spacing w:after="80"/>
+              <w:spacing w:after="0"/>
             </w:pPr>
-            <w:r/>
             <w:r>
               <w:rPr>
                 <w:rFonts w:ascii="Microsoft YaHei" w:hAnsi="Microsoft YaHei" w:eastAsia="Microsoft YaHei"/>
                 <w:b w:val="0"/>
+                <w:color w:val="1F2937"/>
                 <w:sz w:val="21"/>
               </w:rPr>
-              <w:t>274 字</w:t>
+              <w:t>454 字</w:t>
             </w:r>
           </w:p>
         </w:tc>
@@ -1222,13 +1485,13 @@
           </w:tcPr>
           <w:p>
             <w:pPr>
-              <w:spacing w:after="80"/>
+              <w:spacing w:after="0"/>
             </w:pPr>
-            <w:r/>
             <w:r>
               <w:rPr>
                 <w:rFonts w:ascii="Microsoft YaHei" w:hAnsi="Microsoft YaHei" w:eastAsia="Microsoft YaHei"/>
                 <w:b w:val="0"/>
+                <w:color w:val="1F2937"/>
                 <w:sz w:val="21"/>
               </w:rPr>
               <w:t>5 对未来职业的影响</w:t>
@@ -1249,16 +1512,16 @@
           </w:tcPr>
           <w:p>
             <w:pPr>
-              <w:spacing w:after="80"/>
+              <w:spacing w:after="0"/>
             </w:pPr>
-            <w:r/>
             <w:r>
               <w:rPr>
                 <w:rFonts w:ascii="Microsoft YaHei" w:hAnsi="Microsoft YaHei" w:eastAsia="Microsoft YaHei"/>
                 <w:b w:val="0"/>
+                <w:color w:val="1F2937"/>
                 <w:sz w:val="21"/>
               </w:rPr>
-              <w:t>170 字</w:t>
+              <w:t>270 字</w:t>
             </w:r>
           </w:p>
         </w:tc>
@@ -1278,13 +1541,13 @@
           </w:tcPr>
           <w:p>
             <w:pPr>
-              <w:spacing w:after="80"/>
+              <w:spacing w:after="0"/>
             </w:pPr>
-            <w:r/>
             <w:r>
               <w:rPr>
                 <w:rFonts w:ascii="Microsoft YaHei" w:hAnsi="Microsoft YaHei" w:eastAsia="Microsoft YaHei"/>
                 <w:b w:val="0"/>
+                <w:color w:val="1F2937"/>
                 <w:sz w:val="21"/>
               </w:rPr>
               <w:t>6 对课程的改进建议</w:t>
@@ -1305,16 +1568,16 @@
           </w:tcPr>
           <w:p>
             <w:pPr>
-              <w:spacing w:after="80"/>
+              <w:spacing w:after="0"/>
             </w:pPr>
-            <w:r/>
             <w:r>
               <w:rPr>
                 <w:rFonts w:ascii="Microsoft YaHei" w:hAnsi="Microsoft YaHei" w:eastAsia="Microsoft YaHei"/>
                 <w:b w:val="0"/>
+                <w:color w:val="1F2937"/>
                 <w:sz w:val="21"/>
               </w:rPr>
-              <w:t>179 字</w:t>
+              <w:t>336 字</w:t>
             </w:r>
           </w:p>
         </w:tc>
@@ -1334,13 +1597,13 @@
           </w:tcPr>
           <w:p>
             <w:pPr>
-              <w:spacing w:after="80"/>
+              <w:spacing w:after="0"/>
             </w:pPr>
-            <w:r/>
             <w:r>
               <w:rPr>
                 <w:rFonts w:ascii="Microsoft YaHei" w:hAnsi="Microsoft YaHei" w:eastAsia="Microsoft YaHei"/>
                 <w:b/>
+                <w:color w:val="0B6B3A"/>
                 <w:sz w:val="21"/>
               </w:rPr>
               <w:t>总计</w:t>
@@ -1361,16 +1624,16 @@
           </w:tcPr>
           <w:p>
             <w:pPr>
-              <w:spacing w:after="80"/>
+              <w:spacing w:after="0"/>
             </w:pPr>
-            <w:r/>
             <w:r>
               <w:rPr>
                 <w:rFonts w:ascii="Microsoft YaHei" w:hAnsi="Microsoft YaHei" w:eastAsia="Microsoft YaHei"/>
                 <w:b/>
+                <w:color w:val="0B6B3A"/>
                 <w:sz w:val="21"/>
               </w:rPr>
-              <w:t>1465 字，满足 ≥ 800 字要求</w:t>
+              <w:t>2635 字</w:t>
             </w:r>
           </w:p>
         </w:tc>
@@ -1401,16 +1664,26 @@
           </w:tcPr>
           <w:p>
             <w:pPr>
-              <w:spacing w:after="80"/>
+              <w:spacing w:after="80" w:line="293" w:lineRule="auto"/>
+              <w:jc w:val="left"/>
             </w:pPr>
-            <w:r/>
+            <w:r>
+              <w:rPr>
+                <w:rFonts w:ascii="Microsoft YaHei" w:hAnsi="Microsoft YaHei" w:eastAsia="Microsoft YaHei"/>
+                <w:b/>
+                <w:color w:val="0B6B3A"/>
+                <w:sz w:val="21"/>
+              </w:rPr>
+              <w:t>说明：</w:t>
+            </w:r>
             <w:r>
               <w:rPr>
                 <w:rFonts w:ascii="Microsoft YaHei" w:hAnsi="Microsoft YaHei" w:eastAsia="Microsoft YaHei"/>
                 <w:b w:val="0"/>
+                <w:color w:val="1F2937"/>
                 <w:sz w:val="21"/>
               </w:rPr>
-              <w:t>说明：以上字数按六个正文反思章节统计，原模板占位内容已替换；内容以个人学习过程、贡献、失败教训和 AI 辅助软件工程反思为主。</w:t>
+              <w:t>以上字数按六个正文反思章节估算，未计入封面、元信息表、模板标题和本说明。正文已超过每人 800 字要求，并尽量围绕真实学习过程、个人贡献、失败教训和 AI 辅助边界展开。</w:t>
             </w:r>
           </w:p>
         </w:tc>

</xml_diff>